<commit_message>
CS1103 Unit 3: print each tick on its own line for clearer output
Change Clock.displayTime() to println so a console screenshot visibly shows
the time advancing second by second, directly demonstrating continuous
updating for the Output and Logic rubric rows. Recompiled clean with
-Xlint:all and re-ran (verified). Sync docx/md sample-output wording.
</commit_message>
<xml_diff>
--- a/CS1103_Programming_2/Unit3_Multithreading/Assignment/Unit3_Programming_Assignment.docx
+++ b/CS1103_Programming_2/Unit3_Multithreading/Assignment/Unit3_Programming_Assignment.docx
@@ -1121,7 +1121,7 @@
           <w:rFonts w:ascii="Courier New" w:hAnsi="Courier New"/>
           <w:sz w:val="18"/>
         </w:rPr>
-        <w:t xml:space="preserve">     * Prints the current formatted time to the console on a single line.</w:t>
+        <w:t xml:space="preserve">     * Prints the current formatted time to the console on its own line.</w:t>
       </w:r>
     </w:p>
     <w:p>
@@ -1160,20 +1160,33 @@
           <w:rFonts w:ascii="Courier New" w:hAnsi="Courier New"/>
           <w:sz w:val="18"/>
         </w:rPr>
-        <w:t xml:space="preserve">     * The carriage return keeps the clock updating on the same line so the</w:t>
-      </w:r>
-    </w:p>
-    <w:p>
-      <w:pPr>
-        <w:spacing w:line="240" w:lineRule="auto" w:after="0"/>
-        <w:ind w:left="288"/>
-      </w:pPr>
-      <w:r>
-        <w:rPr>
-          <w:rFonts w:ascii="Courier New" w:hAnsi="Courier New"/>
-          <w:sz w:val="18"/>
-        </w:rPr>
-        <w:t xml:space="preserve">     * output reads like a live clock rather than a long scrolling list.&lt;/p&gt;</w:t>
+        <w:t xml:space="preserve">     * Each call prints the latest time on a new line so that a screenshot of</w:t>
+      </w:r>
+    </w:p>
+    <w:p>
+      <w:pPr>
+        <w:spacing w:line="240" w:lineRule="auto" w:after="0"/>
+        <w:ind w:left="288"/>
+      </w:pPr>
+      <w:r>
+        <w:rPr>
+          <w:rFonts w:ascii="Courier New" w:hAnsi="Courier New"/>
+          <w:sz w:val="18"/>
+        </w:rPr>
+        <w:t xml:space="preserve">     * the console clearly shows the clock advancing from one second to the</w:t>
+      </w:r>
+    </w:p>
+    <w:p>
+      <w:pPr>
+        <w:spacing w:line="240" w:lineRule="auto" w:after="0"/>
+        <w:ind w:left="288"/>
+      </w:pPr>
+      <w:r>
+        <w:rPr>
+          <w:rFonts w:ascii="Courier New" w:hAnsi="Courier New"/>
+          <w:sz w:val="18"/>
+        </w:rPr>
+        <w:t xml:space="preserve">     * next, demonstrating that it updates continuously.&lt;/p&gt;</w:t>
       </w:r>
     </w:p>
     <w:p>
@@ -1212,20 +1225,7 @@
           <w:rFonts w:ascii="Courier New" w:hAnsi="Courier New"/>
           <w:sz w:val="18"/>
         </w:rPr>
-        <w:t xml:space="preserve">        System.out.print("\rCurrent time: " + getFormattedTime());</w:t>
-      </w:r>
-    </w:p>
-    <w:p>
-      <w:pPr>
-        <w:spacing w:line="240" w:lineRule="auto" w:after="0"/>
-        <w:ind w:left="288"/>
-      </w:pPr>
-      <w:r>
-        <w:rPr>
-          <w:rFonts w:ascii="Courier New" w:hAnsi="Courier New"/>
-          <w:sz w:val="18"/>
-        </w:rPr>
-        <w:t xml:space="preserve">        System.out.flush();</w:t>
+        <w:t xml:space="preserve">        System.out.println("Current time: " + getFormattedTime());</w:t>
       </w:r>
     </w:p>
     <w:p>
@@ -4419,7 +4419,7 @@
           <w:b w:val="0"/>
           <w:sz w:val="24"/>
         </w:rPr>
-        <w:t>The program was compiled with javac -Xlint:all (no errors or warnings) and produced the output below. The header confirms the two thread priorities (updater 1, display 10), and the clock then updates once per second in the required HH:mm:ss dd-MM-yyyy format until it stops cleanly after the demo period. In the live console the time refreshes on a single line, so the clock reads like a real ticking clock; the lines below show successive updates.</w:t>
+        <w:t>The program was compiled with javac -Xlint:all (no errors or warnings) and produced the output below. The header confirms the two thread priorities (updater 1, display 10), and the clock then updates once per second in the required HH:mm:ss dd-MM-yyyy format until it stops cleanly after the demo period. Each successive line shows the time advancing by one second, which demonstrates that the clock updates continuously.</w:t>
       </w:r>
     </w:p>
     <w:p>

</xml_diff>